<commit_message>
docs: complete Governance Packs documentation pass (SDK 0.11.0)
- SDK README (PyPI-facing): new "Governance Packs" section + [sign] extra
- implementation.md: Governance Packs section (load_packs + authoring/signing)
- runtime-patterns.md: packs as the deterministic tool-onboarding classification
- framework-adapters.md: target line notes packs >= 0.11.0
- governance-packs/{design,roadmap}: status Proposed -> Implemented/Delivered
- 3 existing example READMEs: pointer to Governance Packs (enforcement unchanged)
- spec RMACD_Framework_v1.4.md: 0.11.0 SDK note (packs are SDK-only, not normative)
  + regenerated .docx

512 tests still pass; ruff clean. No code changes in this commit.

Co-Authored-By: Claude Opus 4.8 (1M context) <noreply@anthropic.com>
</commit_message>
<xml_diff>
--- a/docs/RMACD_Framework_v1.4.docx
+++ b/docs/RMACD_Framework_v1.4.docx
@@ -108,7 +108,19 @@
         <w:rPr>
           <w:i/>
         </w:rPr>
-        <w:t xml:space="preserve"> — an optional `LLMToolClassifier` (install extra `rmacd-framework[llm]`) that has a Claude model classify ambiguous tool definitions into RMACD terms with a rationale and confidence score, wired into `MCPRegistryBridge` as a fallback (or replacement) for the keyword heuristic. Every auto-classified MCP tool now carries a capability ceiling capped at its inferred operation and classification provenance metadata, with a `low_confidence_tools()` human-review queue; the bridge registers into an existing enforcer registry and accepts raw MCP `tools/list` responses. The bash classifier learned shell control keywords, process substitution, and additional destructive binaries; registry denials are now audited. LLM classification is advisory input at registration time — runtime enforcement (the §12.5 floor, the agent profile, the capability ceiling) remains deterministic. See CHANGELOG.</w:t>
+        <w:t xml:space="preserve"> — an optional `LLMToolClassifier` (install extra `rmacd-framework[llm]`) that has a Claude model classify ambiguous tool definitions into RMACD terms with a rationale and confidence score, wired into `MCPRegistryBridge` as a fallback (or replacement) for the keyword heuristic. Every auto-classified MCP tool now carries a capability ceiling capped at its inferred operation and classification provenance metadata, with a `low_confidence_tools()` human-review queue; the bridge registers into an existing enforcer registry and accepts raw MCP `tools/list` responses. The bash classifier learned shell control keywords, process substitution, and additional destructive binaries; registry denials are now audited. LLM classification is advisory input at registration time — runtime enforcement (the §12.5 floor, the agent profile, the capability ceiling) remains deterministic. rmacd 0.11.0 added </w:t>
+      </w:r>
+      <w:r>
+        <w:rPr>
+          <w:i/>
+        </w:rPr>
+        <w:t>Governance Packs</w:t>
+      </w:r>
+      <w:r>
+        <w:rPr>
+          <w:i/>
+        </w:rPr>
+        <w:t xml:space="preserve"> (`rmacd.packs`) — declarative, reusable, signable packs that map a tool call to RMACD terms `(operation, data tier, target)` as data instead of hand-written classifiers, with 19 built-in packs, an AI-compile authoring workflow (`rmacd classify`), and Ed25519 signing/drift detection (`rmacd pack sign|verify|diff`). Packs are an SDK capability (not normative); runtime classification stays deterministic. See `docs/governance-packs/` and CHANGELOG.</w:t>
       </w:r>
     </w:p>
     <w:p>

</xml_diff>

<commit_message>
docs(spec): align §9.3 change-management mapping to ITIL 4 terminology
Replace the non-standard "Major Change" / "Human Only" cells with ITIL 4's
actual model: the three change types (Standard / Normal / Emergency), risk
escalating the change authority up to the CAB, and the Restricted
Change/Delete cells framed as the §12.5 human-authority-only boundary.
Note the ITIL 4 "change enablement" rename and map RMACD emergency
escalation to ITIL Emergency changes.

Co-Authored-By: Claude Opus 4.8 (1M context) <noreply@anthropic.com>
</commit_message>
<xml_diff>
--- a/docs/RMACD_Framework_v1.4.docx
+++ b/docs/RMACD_Framework_v1.4.docx
@@ -7470,7 +7470,43 @@
     </w:p>
     <w:p>
       <w:r>
-        <w:t>RMACD integrates naturally with existing ITIL change management processes. The combination of operation type and data classification determines the appropriate change category:</w:t>
+        <w:t xml:space="preserve">RMACD integrates naturally with existing ITIL change management — termed </w:t>
+      </w:r>
+      <w:r>
+        <w:rPr>
+          <w:b/>
+        </w:rPr>
+        <w:t>change enablement</w:t>
+      </w:r>
+      <w:r>
+        <w:t xml:space="preserve"> in ITIL 4. ITIL 4 recognizes three change types: </w:t>
+      </w:r>
+      <w:r>
+        <w:rPr>
+          <w:b/>
+        </w:rPr>
+        <w:t>Standard</w:t>
+      </w:r>
+      <w:r>
+        <w:t xml:space="preserve"> (pre-authorized, low-risk, repeatable), </w:t>
+      </w:r>
+      <w:r>
+        <w:rPr>
+          <w:b/>
+        </w:rPr>
+        <w:t>Normal</w:t>
+      </w:r>
+      <w:r>
+        <w:t xml:space="preserve"> (risk-assessed, authorized by the appropriate change authority), and </w:t>
+      </w:r>
+      <w:r>
+        <w:rPr>
+          <w:b/>
+        </w:rPr>
+        <w:t>Emergency</w:t>
+      </w:r>
+      <w:r>
+        <w:t xml:space="preserve"> (expedited for urgent situations). The combination of RMACD operation and data classification determines which change type applies and the change authority required:</w:t>
       </w:r>
     </w:p>
     <w:tbl>
@@ -7636,7 +7672,7 @@
               <w:rPr>
                 <w:sz w:val="19"/>
               </w:rPr>
-              <w:t>Standard Change</w:t>
+              <w:t>Standard change</w:t>
             </w:r>
           </w:p>
         </w:tc>
@@ -7674,7 +7710,7 @@
               <w:rPr>
                 <w:sz w:val="19"/>
               </w:rPr>
-              <w:t>Standard Change</w:t>
+              <w:t>Standard change</w:t>
             </w:r>
           </w:p>
         </w:tc>
@@ -7692,7 +7728,7 @@
               <w:rPr>
                 <w:sz w:val="19"/>
               </w:rPr>
-              <w:t>Normal Change</w:t>
+              <w:t>Normal change</w:t>
             </w:r>
           </w:p>
         </w:tc>
@@ -7710,7 +7746,7 @@
               <w:rPr>
                 <w:sz w:val="19"/>
               </w:rPr>
-              <w:t>Major Change</w:t>
+              <w:t>Normal change (CAB)</w:t>
             </w:r>
           </w:p>
         </w:tc>
@@ -7748,7 +7784,7 @@
               <w:rPr>
                 <w:sz w:val="19"/>
               </w:rPr>
-              <w:t>Standard Change</w:t>
+              <w:t>Standard change</w:t>
             </w:r>
           </w:p>
         </w:tc>
@@ -7766,7 +7802,7 @@
               <w:rPr>
                 <w:sz w:val="19"/>
               </w:rPr>
-              <w:t>Normal Change</w:t>
+              <w:t>Normal change</w:t>
             </w:r>
           </w:p>
         </w:tc>
@@ -7784,7 +7820,7 @@
               <w:rPr>
                 <w:sz w:val="19"/>
               </w:rPr>
-              <w:t>Major Change</w:t>
+              <w:t>Normal change (CAB)</w:t>
             </w:r>
           </w:p>
         </w:tc>
@@ -7822,7 +7858,7 @@
               <w:rPr>
                 <w:sz w:val="19"/>
               </w:rPr>
-              <w:t>Normal Change</w:t>
+              <w:t>Normal change</w:t>
             </w:r>
           </w:p>
         </w:tc>
@@ -7840,7 +7876,7 @@
               <w:rPr>
                 <w:sz w:val="19"/>
               </w:rPr>
-              <w:t>Major Change</w:t>
+              <w:t>Normal change (CAB)</w:t>
             </w:r>
           </w:p>
         </w:tc>
@@ -7858,7 +7894,7 @@
               <w:rPr>
                 <w:sz w:val="19"/>
               </w:rPr>
-              <w:t>Human Only</w:t>
+              <w:t>Human authority only¹</w:t>
             </w:r>
           </w:p>
         </w:tc>
@@ -7896,7 +7932,7 @@
               <w:rPr>
                 <w:sz w:val="19"/>
               </w:rPr>
-              <w:t>Normal Change</w:t>
+              <w:t>Normal change</w:t>
             </w:r>
           </w:p>
         </w:tc>
@@ -7914,7 +7950,7 @@
               <w:rPr>
                 <w:sz w:val="19"/>
               </w:rPr>
-              <w:t>Major Change</w:t>
+              <w:t>Normal change (CAB)</w:t>
             </w:r>
           </w:p>
         </w:tc>
@@ -7932,13 +7968,59 @@
               <w:rPr>
                 <w:sz w:val="19"/>
               </w:rPr>
-              <w:t>Human Only</w:t>
+              <w:t>Human authority only¹</w:t>
             </w:r>
           </w:p>
         </w:tc>
       </w:tr>
     </w:tbl>
     <w:p/>
+    <w:p>
+      <w:r>
+        <w:t xml:space="preserve">¹ Change/Delete on Restricted is </w:t>
+      </w:r>
+      <w:r>
+        <w:rPr>
+          <w:b/>
+        </w:rPr>
+        <w:t>prohibited for autonomous agents</w:t>
+      </w:r>
+      <w:r>
+        <w:t xml:space="preserve"> by the §12.5 immutable safety floor — these are never issued as an automated change and always require a human change authority.</w:t>
+      </w:r>
+    </w:p>
+    <w:p>
+      <w:r>
+        <w:t xml:space="preserve">Higher-risk cells escalate the </w:t>
+      </w:r>
+      <w:r>
+        <w:rPr>
+          <w:b/>
+        </w:rPr>
+        <w:t>change authority</w:t>
+      </w:r>
+      <w:r>
+        <w:t xml:space="preserve"> — from delegated or automated approval for low-risk normal changes up to the Change Advisory Board (CAB) for high-risk ones — consistent with ITIL 4's risk-based authorization model. RMACD's </w:t>
+      </w:r>
+      <w:r>
+        <w:rPr>
+          <w:b/>
+        </w:rPr>
+        <w:t>emergency-escalation</w:t>
+      </w:r>
+      <w:r>
+        <w:t xml:space="preserve"> controls correspond directly to ITIL's </w:t>
+      </w:r>
+      <w:r>
+        <w:rPr>
+          <w:b/>
+        </w:rPr>
+        <w:t>Emergency change</w:t>
+      </w:r>
+      <w:r>
+        <w:t xml:space="preserve"> type: a time-boxed, expedited path with heightened logging and mandatory post-hoc review.</w:t>
+      </w:r>
+    </w:p>
     <w:p>
       <w:pPr>
         <w:pStyle w:val="Heading2"/>

</xml_diff>

<commit_message>
docs: add author ORCID to LICENSE and spec title page
Co-Authored-By: Claude Fable 5 <noreply@anthropic.com>
</commit_message>
<xml_diff>
--- a/docs/RMACD_Framework_v1.4.docx
+++ b/docs/RMACD_Framework_v1.4.docx
@@ -49,6 +49,15 @@
           <w:b/>
         </w:rPr>
         <w:t>Author: Kash Kashyap</w:t>
+      </w:r>
+      <w:r>
+        <w:t xml:space="preserve"> (</w:t>
+      </w:r>
+      <w:r>
+        <w:t>ORCID: 0009-0005-0127-6265</w:t>
+      </w:r>
+      <w:r>
+        <w:t>)</w:t>
       </w:r>
     </w:p>
     <w:p>

</xml_diff>

<commit_message>
docs: 0.13.0 documentation pass — Claude Code quickstart, spec SDK-updates note, consistency sweep
- README: 'Use with Claude Code' section (3-step plugin quickstart, pip
  install with [mcp] extra, session-governance paragraph with the live
  observer-3d deny message, links to docs/claude-code.md and the plugin
  README); Documentation list gains claude-code.md and audit-evidence.md
- Spec v1.4: 'Version 1.4.0 SDK updates (July 2026)' note covering rmacd
  0.13.0 (session governance, plugin, 34 packs, composition, MCP server,
  audit evidence); docx regenerated
- Governance-packs docs: catalog heading no longer '(planned)'; design.md
  and roadmap.md status brought to 0.13.0 (34 packs, composition) with a
  Post-0.12.0 follow-on section

Co-Authored-By: Claude Fable 5 <noreply@anthropic.com>
</commit_message>
<xml_diff>
--- a/docs/RMACD_Framework_v1.4.docx
+++ b/docs/RMACD_Framework_v1.4.docx
@@ -142,6 +142,86 @@
           <w:i/>
         </w:rPr>
         <w:t xml:space="preserve"> total — and promoted `CLIApprovalGateway` into the SDK so an approval-gated agent is testable straight from `pip install`. See `docs/governance-packs/` and CHANGELOG.</w:t>
+      </w:r>
+    </w:p>
+    <w:p>
+      <w:r>
+        <w:rPr>
+          <w:i/>
+        </w:rPr>
+        <w:t xml:space="preserve">Version 1.4.0 SDK updates (July 2026): rmacd 0.13.0 added </w:t>
+      </w:r>
+      <w:r>
+        <w:rPr>
+          <w:i/>
+        </w:rPr>
+        <w:t>session governance for Claude Code</w:t>
+      </w:r>
+      <w:r>
+        <w:rPr>
+          <w:i/>
+        </w:rPr>
+        <w:t xml:space="preserve"> (`rmacd.claude_code`) — a deterministic `PreToolUse` hook (`python3 -m rmacd.claude_code.hook`) that binds a profile to a Claude Code session and evaluates the session's own Bash/file/MCP tool calls against it before they run (unbound sessions pass through; bound sessions fail closed; approval-level autonomy maps to Claude Code's permission prompt), shipped with a </w:t>
+      </w:r>
+      <w:r>
+        <w:rPr>
+          <w:i/>
+        </w:rPr>
+        <w:t>Claude Code plugin</w:t>
+      </w:r>
+      <w:r>
+        <w:rPr>
+          <w:i/>
+        </w:rPr>
+        <w:t xml:space="preserve"> (`plugins/rmacd/`, installed via `/plugin marketplace add rmacdframework/spec`) carrying the `rmacd-integrate` skill, `/rmacd:init`, and `/rmacd:status`. The built-in pack catalog grew from 22 to </w:t>
+      </w:r>
+      <w:r>
+        <w:rPr>
+          <w:i/>
+        </w:rPr>
+        <w:t>34 packs</w:t>
+      </w:r>
+      <w:r>
+        <w:rPr>
+          <w:i/>
+        </w:rPr>
+        <w:t xml:space="preserve"> (developer toolchain: `git`, `gh`, `docker`, `terraform`, `npm`, `pip-uv`, `make`; enterprise operations: `helm`, `vault`, `ssh-transfer`, `stripe`, `servicenow`), and </w:t>
+      </w:r>
+      <w:r>
+        <w:rPr>
+          <w:i/>
+        </w:rPr>
+        <w:t>pack composition</w:t>
+      </w:r>
+      <w:r>
+        <w:rPr>
+          <w:i/>
+        </w:rPr>
+        <w:t xml:space="preserve"> (`rmacd.packs.composition`) lets multiple packs govern the same tool name — most-specific claim wins, severity breaks ties fail-closed, each match carries its own pack's capability ceiling. An optional </w:t>
+      </w:r>
+      <w:r>
+        <w:rPr>
+          <w:i/>
+        </w:rPr>
+        <w:t>MCP server</w:t>
+      </w:r>
+      <w:r>
+        <w:rPr>
+          <w:i/>
+        </w:rPr>
+        <w:t xml:space="preserve"> (`rmacd.mcp_server`, install extra `rmacd-framework[mcp]`, CLI `rmacd mcp-serve`) exposes read-only policy tools (evaluate, validate, matrix, pack info, bash classification) to any MCP client. </w:t>
+      </w:r>
+      <w:r>
+        <w:rPr>
+          <w:i/>
+        </w:rPr>
+        <w:t>Audit evidence</w:t>
+      </w:r>
+      <w:r>
+        <w:rPr>
+          <w:i/>
+        </w:rPr>
+        <w:t xml:space="preserve"> arrived as `rmacd audit summarize` (text/json/markdown reports with an operation×tier matrix and §12.5-floor hits) plus `docs/audit-evidence.md` (SIEM shipping and SOC 2 / ISO 27001 / GDPR mapping via §10). All additive and deterministic — the §12.5 floor, profile, and capability ceiling remain the runtime gates. See `docs/claude-code.md` and CHANGELOG.</w:t>
       </w:r>
     </w:p>
     <w:p>

</xml_diff>